<commit_message>
Improve tratte detection: raise intersection threshold to 80%, reduce to 6 tratte
- Intersection threshold: 0.72 → 0.80 (V85 < 80% of corridor median)
  Ostia: 1 → 9 intersections detected, Centro: 5 → 11
- Breakpoints: 8 → 5 (resulting in 6 tratte per direction instead of 9)
- Updated HTML methodology text to reflect 80% threshold

https://claude.ai/code/session_01C9yS1ptJzWrM5YXS1NsW3z
</commit_message>
<xml_diff>
--- a/output_colombo/ridotto/report_ridotto_colombo.docx
+++ b/output_colombo/ridotto/report_ridotto_colombo.docx
@@ -6294,7 +6294,7 @@
               <w:rPr>
                 <w:sz w:val="16"/>
               </w:rPr>
-              <w:t>366–949 m</w:t>
+              <w:t>366–5433 m</w:t>
             </w:r>
           </w:p>
         </w:tc>
@@ -6310,7 +6310,7 @@
               <w:rPr>
                 <w:sz w:val="16"/>
               </w:rPr>
-              <w:t>0.58 km</w:t>
+              <w:t>5.07 km</w:t>
             </w:r>
           </w:p>
         </w:tc>
@@ -6326,7 +6326,7 @@
               <w:rPr>
                 <w:sz w:val="16"/>
               </w:rPr>
-              <w:t>93</w:t>
+              <w:t>102</w:t>
             </w:r>
           </w:p>
         </w:tc>
@@ -6358,7 +6358,7 @@
               <w:rPr>
                 <w:sz w:val="16"/>
               </w:rPr>
-              <w:t>98</w:t>
+              <w:t>109</w:t>
             </w:r>
           </w:p>
         </w:tc>
@@ -6374,7 +6374,7 @@
               <w:rPr>
                 <w:sz w:val="16"/>
               </w:rPr>
-              <w:t>4.8%</w:t>
+              <w:t>5.0%</w:t>
             </w:r>
           </w:p>
         </w:tc>
@@ -6408,7 +6408,7 @@
               <w:rPr>
                 <w:sz w:val="16"/>
               </w:rPr>
-              <w:t>949–5433 m</w:t>
+              <w:t>5433–6905 m</w:t>
             </w:r>
           </w:p>
         </w:tc>
@@ -6424,7 +6424,7 @@
               <w:rPr>
                 <w:sz w:val="16"/>
               </w:rPr>
-              <w:t>4.48 km</w:t>
+              <w:t>1.47 km</w:t>
             </w:r>
           </w:p>
         </w:tc>
@@ -6440,7 +6440,7 @@
               <w:rPr>
                 <w:sz w:val="16"/>
               </w:rPr>
-              <w:t>103</w:t>
+              <w:t>90</w:t>
             </w:r>
           </w:p>
         </w:tc>
@@ -6456,7 +6456,7 @@
               <w:rPr>
                 <w:sz w:val="16"/>
               </w:rPr>
-              <w:t>97</w:t>
+              <w:t>82</w:t>
             </w:r>
           </w:p>
         </w:tc>
@@ -6472,7 +6472,7 @@
               <w:rPr>
                 <w:sz w:val="16"/>
               </w:rPr>
-              <w:t>109</w:t>
+              <w:t>100</w:t>
             </w:r>
           </w:p>
         </w:tc>
@@ -6488,7 +6488,7 @@
               <w:rPr>
                 <w:sz w:val="16"/>
               </w:rPr>
-              <w:t>3.8%</w:t>
+              <w:t>7.1%</w:t>
             </w:r>
           </w:p>
         </w:tc>
@@ -6522,7 +6522,7 @@
               <w:rPr>
                 <w:sz w:val="16"/>
               </w:rPr>
-              <w:t>5433–6905 m</w:t>
+              <w:t>6905–8815 m</w:t>
             </w:r>
           </w:p>
         </w:tc>
@@ -6538,7 +6538,7 @@
               <w:rPr>
                 <w:sz w:val="16"/>
               </w:rPr>
-              <w:t>1.47 km</w:t>
+              <w:t>1.91 km</w:t>
             </w:r>
           </w:p>
         </w:tc>
@@ -6554,7 +6554,7 @@
               <w:rPr>
                 <w:sz w:val="16"/>
               </w:rPr>
-              <w:t>90</w:t>
+              <w:t>82</w:t>
             </w:r>
           </w:p>
         </w:tc>
@@ -6570,7 +6570,7 @@
               <w:rPr>
                 <w:sz w:val="16"/>
               </w:rPr>
-              <w:t>82</w:t>
+              <w:t>70</w:t>
             </w:r>
           </w:p>
         </w:tc>
@@ -6586,7 +6586,7 @@
               <w:rPr>
                 <w:sz w:val="16"/>
               </w:rPr>
-              <w:t>100</w:t>
+              <w:t>84</w:t>
             </w:r>
           </w:p>
         </w:tc>
@@ -6602,7 +6602,7 @@
               <w:rPr>
                 <w:sz w:val="16"/>
               </w:rPr>
-              <w:t>7.1%</w:t>
+              <w:t>4.4%</w:t>
             </w:r>
           </w:p>
         </w:tc>
@@ -6636,7 +6636,7 @@
               <w:rPr>
                 <w:sz w:val="16"/>
               </w:rPr>
-              <w:t>6905–8795 m</w:t>
+              <w:t>8703–10554 m</w:t>
             </w:r>
           </w:p>
         </w:tc>
@@ -6652,7 +6652,7 @@
               <w:rPr>
                 <w:sz w:val="16"/>
               </w:rPr>
-              <w:t>1.89 km</w:t>
+              <w:t>1.85 km</w:t>
             </w:r>
           </w:p>
         </w:tc>
@@ -6668,7 +6668,7 @@
               <w:rPr>
                 <w:sz w:val="16"/>
               </w:rPr>
-              <w:t>81</w:t>
+              <w:t>96</w:t>
             </w:r>
           </w:p>
         </w:tc>
@@ -6684,7 +6684,7 @@
               <w:rPr>
                 <w:sz w:val="16"/>
               </w:rPr>
-              <w:t>69</w:t>
+              <w:t>79</w:t>
             </w:r>
           </w:p>
         </w:tc>
@@ -6700,7 +6700,7 @@
               <w:rPr>
                 <w:sz w:val="16"/>
               </w:rPr>
-              <w:t>84</w:t>
+              <w:t>102</w:t>
             </w:r>
           </w:p>
         </w:tc>
@@ -6716,7 +6716,7 @@
               <w:rPr>
                 <w:sz w:val="16"/>
               </w:rPr>
-              <w:t>5.0%</w:t>
+              <w:t>9.2%</w:t>
             </w:r>
           </w:p>
         </w:tc>
@@ -6750,7 +6750,7 @@
               <w:rPr>
                 <w:sz w:val="16"/>
               </w:rPr>
-              <w:t>8795–10384 m</w:t>
+              <w:t>10554–16568 m</w:t>
             </w:r>
           </w:p>
         </w:tc>
@@ -6766,7 +6766,7 @@
               <w:rPr>
                 <w:sz w:val="16"/>
               </w:rPr>
-              <w:t>1.59 km</w:t>
+              <w:t>6.01 km</w:t>
             </w:r>
           </w:p>
         </w:tc>
@@ -6782,7 +6782,7 @@
               <w:rPr>
                 <w:sz w:val="16"/>
               </w:rPr>
-              <w:t>99</w:t>
+              <w:t>88</w:t>
             </w:r>
           </w:p>
         </w:tc>
@@ -6798,7 +6798,7 @@
               <w:rPr>
                 <w:sz w:val="16"/>
               </w:rPr>
-              <w:t>76</w:t>
+              <w:t>71</w:t>
             </w:r>
           </w:p>
         </w:tc>
@@ -6814,7 +6814,7 @@
               <w:rPr>
                 <w:sz w:val="16"/>
               </w:rPr>
-              <w:t>102</w:t>
+              <w:t>97</w:t>
             </w:r>
           </w:p>
         </w:tc>
@@ -6830,349 +6830,7 @@
               <w:rPr>
                 <w:sz w:val="16"/>
               </w:rPr>
-              <w:t>7.8%</w:t>
-            </w:r>
-          </w:p>
-        </w:tc>
-      </w:tr>
-      <w:tr>
-        <w:tc>
-          <w:tcPr>
-            <w:tcW w:type="dxa" w:w="1377"/>
-          </w:tcPr>
-          <w:p>
-            <w:pPr>
-              <w:jc w:val="center"/>
-            </w:pPr>
-            <w:r>
-              <w:rPr>
-                <w:sz w:val="16"/>
-              </w:rPr>
-              <w:t>T7</w:t>
-            </w:r>
-          </w:p>
-        </w:tc>
-        <w:tc>
-          <w:tcPr>
-            <w:tcW w:type="dxa" w:w="1377"/>
-          </w:tcPr>
-          <w:p>
-            <w:pPr>
-              <w:jc w:val="center"/>
-            </w:pPr>
-            <w:r>
-              <w:rPr>
-                <w:sz w:val="16"/>
-              </w:rPr>
-              <w:t>9850–13325 m</w:t>
-            </w:r>
-          </w:p>
-        </w:tc>
-        <w:tc>
-          <w:tcPr>
-            <w:tcW w:type="dxa" w:w="1377"/>
-          </w:tcPr>
-          <w:p>
-            <w:pPr>
-              <w:jc w:val="center"/>
-            </w:pPr>
-            <w:r>
-              <w:rPr>
-                <w:sz w:val="16"/>
-              </w:rPr>
-              <w:t>3.48 km</w:t>
-            </w:r>
-          </w:p>
-        </w:tc>
-        <w:tc>
-          <w:tcPr>
-            <w:tcW w:type="dxa" w:w="1377"/>
-          </w:tcPr>
-          <w:p>
-            <w:pPr>
-              <w:jc w:val="center"/>
-            </w:pPr>
-            <w:r>
-              <w:rPr>
-                <w:sz w:val="16"/>
-              </w:rPr>
-              <w:t>84</w:t>
-            </w:r>
-          </w:p>
-        </w:tc>
-        <w:tc>
-          <w:tcPr>
-            <w:tcW w:type="dxa" w:w="1377"/>
-          </w:tcPr>
-          <w:p>
-            <w:pPr>
-              <w:jc w:val="center"/>
-            </w:pPr>
-            <w:r>
-              <w:rPr>
-                <w:sz w:val="16"/>
-              </w:rPr>
-              <w:t>66</w:t>
-            </w:r>
-          </w:p>
-        </w:tc>
-        <w:tc>
-          <w:tcPr>
-            <w:tcW w:type="dxa" w:w="1377"/>
-          </w:tcPr>
-          <w:p>
-            <w:pPr>
-              <w:jc w:val="center"/>
-            </w:pPr>
-            <w:r>
-              <w:rPr>
-                <w:sz w:val="16"/>
-              </w:rPr>
-              <w:t>94</w:t>
-            </w:r>
-          </w:p>
-        </w:tc>
-        <w:tc>
-          <w:tcPr>
-            <w:tcW w:type="dxa" w:w="1377"/>
-          </w:tcPr>
-          <w:p>
-            <w:pPr>
-              <w:jc w:val="center"/>
-            </w:pPr>
-            <w:r>
-              <w:rPr>
-                <w:sz w:val="16"/>
-              </w:rPr>
-              <w:t>11.6%</w:t>
-            </w:r>
-          </w:p>
-        </w:tc>
-      </w:tr>
-      <w:tr>
-        <w:tc>
-          <w:tcPr>
-            <w:tcW w:type="dxa" w:w="1377"/>
-          </w:tcPr>
-          <w:p>
-            <w:pPr>
-              <w:jc w:val="center"/>
-            </w:pPr>
-            <w:r>
-              <w:rPr>
-                <w:sz w:val="16"/>
-              </w:rPr>
-              <w:t>T8</w:t>
-            </w:r>
-          </w:p>
-        </w:tc>
-        <w:tc>
-          <w:tcPr>
-            <w:tcW w:type="dxa" w:w="1377"/>
-          </w:tcPr>
-          <w:p>
-            <w:pPr>
-              <w:jc w:val="center"/>
-            </w:pPr>
-            <w:r>
-              <w:rPr>
-                <w:sz w:val="16"/>
-              </w:rPr>
-              <w:t>13325–16416 m</w:t>
-            </w:r>
-          </w:p>
-        </w:tc>
-        <w:tc>
-          <w:tcPr>
-            <w:tcW w:type="dxa" w:w="1377"/>
-          </w:tcPr>
-          <w:p>
-            <w:pPr>
-              <w:jc w:val="center"/>
-            </w:pPr>
-            <w:r>
-              <w:rPr>
-                <w:sz w:val="16"/>
-              </w:rPr>
-              <w:t>3.09 km</w:t>
-            </w:r>
-          </w:p>
-        </w:tc>
-        <w:tc>
-          <w:tcPr>
-            <w:tcW w:type="dxa" w:w="1377"/>
-          </w:tcPr>
-          <w:p>
-            <w:pPr>
-              <w:jc w:val="center"/>
-            </w:pPr>
-            <w:r>
-              <w:rPr>
-                <w:sz w:val="16"/>
-              </w:rPr>
-              <w:t>91</w:t>
-            </w:r>
-          </w:p>
-        </w:tc>
-        <w:tc>
-          <w:tcPr>
-            <w:tcW w:type="dxa" w:w="1377"/>
-          </w:tcPr>
-          <w:p>
-            <w:pPr>
-              <w:jc w:val="center"/>
-            </w:pPr>
-            <w:r>
-              <w:rPr>
-                <w:sz w:val="16"/>
-              </w:rPr>
-              <w:t>79</w:t>
-            </w:r>
-          </w:p>
-        </w:tc>
-        <w:tc>
-          <w:tcPr>
-            <w:tcW w:type="dxa" w:w="1377"/>
-          </w:tcPr>
-          <w:p>
-            <w:pPr>
-              <w:jc w:val="center"/>
-            </w:pPr>
-            <w:r>
-              <w:rPr>
-                <w:sz w:val="16"/>
-              </w:rPr>
-              <w:t>97</w:t>
-            </w:r>
-          </w:p>
-        </w:tc>
-        <w:tc>
-          <w:tcPr>
-            <w:tcW w:type="dxa" w:w="1377"/>
-          </w:tcPr>
-          <w:p>
-            <w:pPr>
-              <w:jc w:val="center"/>
-            </w:pPr>
-            <w:r>
-              <w:rPr>
-                <w:sz w:val="16"/>
-              </w:rPr>
-              <w:t>5.9%</w:t>
-            </w:r>
-          </w:p>
-        </w:tc>
-      </w:tr>
-      <w:tr>
-        <w:tc>
-          <w:tcPr>
-            <w:tcW w:type="dxa" w:w="1377"/>
-          </w:tcPr>
-          <w:p>
-            <w:pPr>
-              <w:jc w:val="center"/>
-            </w:pPr>
-            <w:r>
-              <w:rPr>
-                <w:sz w:val="16"/>
-              </w:rPr>
-              <w:t>T9</w:t>
-            </w:r>
-          </w:p>
-        </w:tc>
-        <w:tc>
-          <w:tcPr>
-            <w:tcW w:type="dxa" w:w="1377"/>
-          </w:tcPr>
-          <w:p>
-            <w:pPr>
-              <w:jc w:val="center"/>
-            </w:pPr>
-            <w:r>
-              <w:rPr>
-                <w:sz w:val="16"/>
-              </w:rPr>
-              <w:t>16416–16568 m</w:t>
-            </w:r>
-          </w:p>
-        </w:tc>
-        <w:tc>
-          <w:tcPr>
-            <w:tcW w:type="dxa" w:w="1377"/>
-          </w:tcPr>
-          <w:p>
-            <w:pPr>
-              <w:jc w:val="center"/>
-            </w:pPr>
-            <w:r>
-              <w:rPr>
-                <w:sz w:val="16"/>
-              </w:rPr>
-              <w:t>0.15 km</w:t>
-            </w:r>
-          </w:p>
-        </w:tc>
-        <w:tc>
-          <w:tcPr>
-            <w:tcW w:type="dxa" w:w="1377"/>
-          </w:tcPr>
-          <w:p>
-            <w:pPr>
-              <w:jc w:val="center"/>
-            </w:pPr>
-            <w:r>
-              <w:rPr>
-                <w:sz w:val="16"/>
-              </w:rPr>
-              <w:t>72</w:t>
-            </w:r>
-          </w:p>
-        </w:tc>
-        <w:tc>
-          <w:tcPr>
-            <w:tcW w:type="dxa" w:w="1377"/>
-          </w:tcPr>
-          <w:p>
-            <w:pPr>
-              <w:jc w:val="center"/>
-            </w:pPr>
-            <w:r>
-              <w:rPr>
-                <w:sz w:val="16"/>
-              </w:rPr>
-              <w:t>66</w:t>
-            </w:r>
-          </w:p>
-        </w:tc>
-        <w:tc>
-          <w:tcPr>
-            <w:tcW w:type="dxa" w:w="1377"/>
-          </w:tcPr>
-          <w:p>
-            <w:pPr>
-              <w:jc w:val="center"/>
-            </w:pPr>
-            <w:r>
-              <w:rPr>
-                <w:sz w:val="16"/>
-              </w:rPr>
-              <w:t>76</w:t>
-            </w:r>
-          </w:p>
-        </w:tc>
-        <w:tc>
-          <w:tcPr>
-            <w:tcW w:type="dxa" w:w="1377"/>
-          </w:tcPr>
-          <w:p>
-            <w:pPr>
-              <w:jc w:val="center"/>
-            </w:pPr>
-            <w:r>
-              <w:rPr>
-                <w:sz w:val="16"/>
-              </w:rPr>
-              <w:t>5.8%</w:t>
+              <w:t>8.4%</w:t>
             </w:r>
           </w:p>
         </w:tc>
@@ -7180,7 +6838,7 @@
     </w:tbl>
     <w:p>
       <w:r>
-        <w:t>1 segmenti di intersezione esclusi dal calcolo.</w:t>
+        <w:t>9 segmenti di intersezione esclusi dal calcolo.</w:t>
       </w:r>
     </w:p>
     <w:p>
@@ -7357,7 +7015,7 @@
               <w:rPr>
                 <w:sz w:val="16"/>
               </w:rPr>
-              <w:t>0–2684 m</w:t>
+              <w:t>0–4942 m</w:t>
             </w:r>
           </w:p>
         </w:tc>
@@ -7373,7 +7031,7 @@
               <w:rPr>
                 <w:sz w:val="16"/>
               </w:rPr>
-              <w:t>2.68 km</w:t>
+              <w:t>4.94 km</w:t>
             </w:r>
           </w:p>
         </w:tc>
@@ -7389,7 +7047,7 @@
               <w:rPr>
                 <w:sz w:val="16"/>
               </w:rPr>
-              <w:t>86</w:t>
+              <w:t>84</w:t>
             </w:r>
           </w:p>
         </w:tc>
@@ -7437,7 +7095,7 @@
               <w:rPr>
                 <w:sz w:val="16"/>
               </w:rPr>
-              <w:t>8.2%</w:t>
+              <w:t>8.8%</w:t>
             </w:r>
           </w:p>
         </w:tc>
@@ -7471,7 +7129,7 @@
               <w:rPr>
                 <w:sz w:val="16"/>
               </w:rPr>
-              <w:t>2684–4690 m</w:t>
+              <w:t>4742–7996 m</w:t>
             </w:r>
           </w:p>
         </w:tc>
@@ -7487,7 +7145,7 @@
               <w:rPr>
                 <w:sz w:val="16"/>
               </w:rPr>
-              <w:t>2.01 km</w:t>
+              <w:t>3.25 km</w:t>
             </w:r>
           </w:p>
         </w:tc>
@@ -7503,7 +7161,7 @@
               <w:rPr>
                 <w:sz w:val="16"/>
               </w:rPr>
-              <w:t>81</w:t>
+              <w:t>86</w:t>
             </w:r>
           </w:p>
         </w:tc>
@@ -7519,7 +7177,7 @@
               <w:rPr>
                 <w:sz w:val="16"/>
               </w:rPr>
-              <w:t>66</w:t>
+              <w:t>73</w:t>
             </w:r>
           </w:p>
         </w:tc>
@@ -7551,7 +7209,7 @@
               <w:rPr>
                 <w:sz w:val="16"/>
               </w:rPr>
-              <w:t>9.0%</w:t>
+              <w:t>5.0%</w:t>
             </w:r>
           </w:p>
         </w:tc>
@@ -7585,7 +7243,7 @@
               <w:rPr>
                 <w:sz w:val="16"/>
               </w:rPr>
-              <w:t>4690–6255 m</w:t>
+              <w:t>7996–9763 m</w:t>
             </w:r>
           </w:p>
         </w:tc>
@@ -7601,7 +7259,7 @@
               <w:rPr>
                 <w:sz w:val="16"/>
               </w:rPr>
-              <w:t>1.57 km</w:t>
+              <w:t>1.77 km</w:t>
             </w:r>
           </w:p>
         </w:tc>
@@ -7617,7 +7275,7 @@
               <w:rPr>
                 <w:sz w:val="16"/>
               </w:rPr>
-              <w:t>83</w:t>
+              <w:t>89</w:t>
             </w:r>
           </w:p>
         </w:tc>
@@ -7633,7 +7291,7 @@
               <w:rPr>
                 <w:sz w:val="16"/>
               </w:rPr>
-              <w:t>66</w:t>
+              <w:t>85</w:t>
             </w:r>
           </w:p>
         </w:tc>
@@ -7649,7 +7307,7 @@
               <w:rPr>
                 <w:sz w:val="16"/>
               </w:rPr>
-              <w:t>86</w:t>
+              <w:t>91</w:t>
             </w:r>
           </w:p>
         </w:tc>
@@ -7665,7 +7323,7 @@
               <w:rPr>
                 <w:sz w:val="16"/>
               </w:rPr>
-              <w:t>7.5%</w:t>
+              <w:t>1.7%</w:t>
             </w:r>
           </w:p>
         </w:tc>
@@ -7699,7 +7357,7 @@
               <w:rPr>
                 <w:sz w:val="16"/>
               </w:rPr>
-              <w:t>6255–7942 m</w:t>
+              <w:t>9763–15680 m</w:t>
             </w:r>
           </w:p>
         </w:tc>
@@ -7715,7 +7373,7 @@
               <w:rPr>
                 <w:sz w:val="16"/>
               </w:rPr>
-              <w:t>1.69 km</w:t>
+              <w:t>5.92 km</w:t>
             </w:r>
           </w:p>
         </w:tc>
@@ -7731,7 +7389,7 @@
               <w:rPr>
                 <w:sz w:val="16"/>
               </w:rPr>
-              <w:t>84</w:t>
+              <w:t>103</w:t>
             </w:r>
           </w:p>
         </w:tc>
@@ -7747,7 +7405,7 @@
               <w:rPr>
                 <w:sz w:val="16"/>
               </w:rPr>
-              <w:t>67</w:t>
+              <w:t>96</w:t>
             </w:r>
           </w:p>
         </w:tc>
@@ -7763,7 +7421,7 @@
               <w:rPr>
                 <w:sz w:val="16"/>
               </w:rPr>
-              <w:t>88</w:t>
+              <w:t>110</w:t>
             </w:r>
           </w:p>
         </w:tc>
@@ -7779,7 +7437,7 @@
               <w:rPr>
                 <w:sz w:val="16"/>
               </w:rPr>
-              <w:t>9.0%</w:t>
+              <w:t>4.1%</w:t>
             </w:r>
           </w:p>
         </w:tc>
@@ -7813,7 +7471,7 @@
               <w:rPr>
                 <w:sz w:val="16"/>
               </w:rPr>
-              <w:t>7942–9425 m</w:t>
+              <w:t>15680–16003 m</w:t>
             </w:r>
           </w:p>
         </w:tc>
@@ -7829,7 +7487,7 @@
               <w:rPr>
                 <w:sz w:val="16"/>
               </w:rPr>
-              <w:t>1.48 km</w:t>
+              <w:t>0.32 km</w:t>
             </w:r>
           </w:p>
         </w:tc>
@@ -7845,7 +7503,7 @@
               <w:rPr>
                 <w:sz w:val="16"/>
               </w:rPr>
-              <w:t>89</w:t>
+              <w:t>92</w:t>
             </w:r>
           </w:p>
         </w:tc>
@@ -7877,7 +7535,7 @@
               <w:rPr>
                 <w:sz w:val="16"/>
               </w:rPr>
-              <w:t>91</w:t>
+              <w:t>100</w:t>
             </w:r>
           </w:p>
         </w:tc>
@@ -7893,7 +7551,7 @@
               <w:rPr>
                 <w:sz w:val="16"/>
               </w:rPr>
-              <w:t>2.4%</w:t>
+              <w:t>7.0%</w:t>
             </w:r>
           </w:p>
         </w:tc>
@@ -7927,7 +7585,7 @@
               <w:rPr>
                 <w:sz w:val="16"/>
               </w:rPr>
-              <w:t>9425–14075 m</w:t>
+              <w:t>16003–16182 m</w:t>
             </w:r>
           </w:p>
         </w:tc>
@@ -7943,7 +7601,7 @@
               <w:rPr>
                 <w:sz w:val="16"/>
               </w:rPr>
-              <w:t>4.65 km</w:t>
+              <w:t>0.18 km</w:t>
             </w:r>
           </w:p>
         </w:tc>
@@ -7959,7 +7617,7 @@
               <w:rPr>
                 <w:sz w:val="16"/>
               </w:rPr>
-              <w:t>101</w:t>
+              <w:t>74</w:t>
             </w:r>
           </w:p>
         </w:tc>
@@ -7975,7 +7633,7 @@
               <w:rPr>
                 <w:sz w:val="16"/>
               </w:rPr>
-              <w:t>89</w:t>
+              <w:t>73</w:t>
             </w:r>
           </w:p>
         </w:tc>
@@ -7991,7 +7649,7 @@
               <w:rPr>
                 <w:sz w:val="16"/>
               </w:rPr>
-              <w:t>110</w:t>
+              <w:t>80</w:t>
             </w:r>
           </w:p>
         </w:tc>
@@ -8007,349 +7665,7 @@
               <w:rPr>
                 <w:sz w:val="16"/>
               </w:rPr>
-              <w:t>4.9%</w:t>
-            </w:r>
-          </w:p>
-        </w:tc>
-      </w:tr>
-      <w:tr>
-        <w:tc>
-          <w:tcPr>
-            <w:tcW w:type="dxa" w:w="1377"/>
-          </w:tcPr>
-          <w:p>
-            <w:pPr>
-              <w:jc w:val="center"/>
-            </w:pPr>
-            <w:r>
-              <w:rPr>
-                <w:sz w:val="16"/>
-              </w:rPr>
-              <w:t>T7</w:t>
-            </w:r>
-          </w:p>
-        </w:tc>
-        <w:tc>
-          <w:tcPr>
-            <w:tcW w:type="dxa" w:w="1377"/>
-          </w:tcPr>
-          <w:p>
-            <w:pPr>
-              <w:jc w:val="center"/>
-            </w:pPr>
-            <w:r>
-              <w:rPr>
-                <w:sz w:val="16"/>
-              </w:rPr>
-              <w:t>14075–15637 m</w:t>
-            </w:r>
-          </w:p>
-        </w:tc>
-        <w:tc>
-          <w:tcPr>
-            <w:tcW w:type="dxa" w:w="1377"/>
-          </w:tcPr>
-          <w:p>
-            <w:pPr>
-              <w:jc w:val="center"/>
-            </w:pPr>
-            <w:r>
-              <w:rPr>
-                <w:sz w:val="16"/>
-              </w:rPr>
-              <w:t>1.56 km</w:t>
-            </w:r>
-          </w:p>
-        </w:tc>
-        <w:tc>
-          <w:tcPr>
-            <w:tcW w:type="dxa" w:w="1377"/>
-          </w:tcPr>
-          <w:p>
-            <w:pPr>
-              <w:jc w:val="center"/>
-            </w:pPr>
-            <w:r>
-              <w:rPr>
-                <w:sz w:val="16"/>
-              </w:rPr>
-              <w:t>108</w:t>
-            </w:r>
-          </w:p>
-        </w:tc>
-        <w:tc>
-          <w:tcPr>
-            <w:tcW w:type="dxa" w:w="1377"/>
-          </w:tcPr>
-          <w:p>
-            <w:pPr>
-              <w:jc w:val="center"/>
-            </w:pPr>
-            <w:r>
-              <w:rPr>
-                <w:sz w:val="16"/>
-              </w:rPr>
-              <w:t>103</w:t>
-            </w:r>
-          </w:p>
-        </w:tc>
-        <w:tc>
-          <w:tcPr>
-            <w:tcW w:type="dxa" w:w="1377"/>
-          </w:tcPr>
-          <w:p>
-            <w:pPr>
-              <w:jc w:val="center"/>
-            </w:pPr>
-            <w:r>
-              <w:rPr>
-                <w:sz w:val="16"/>
-              </w:rPr>
-              <w:t>110</w:t>
-            </w:r>
-          </w:p>
-        </w:tc>
-        <w:tc>
-          <w:tcPr>
-            <w:tcW w:type="dxa" w:w="1377"/>
-          </w:tcPr>
-          <w:p>
-            <w:pPr>
-              <w:jc w:val="center"/>
-            </w:pPr>
-            <w:r>
-              <w:rPr>
-                <w:sz w:val="16"/>
-              </w:rPr>
-              <w:t>1.6%</w:t>
-            </w:r>
-          </w:p>
-        </w:tc>
-      </w:tr>
-      <w:tr>
-        <w:tc>
-          <w:tcPr>
-            <w:tcW w:type="dxa" w:w="1377"/>
-          </w:tcPr>
-          <w:p>
-            <w:pPr>
-              <w:jc w:val="center"/>
-            </w:pPr>
-            <w:r>
-              <w:rPr>
-                <w:sz w:val="16"/>
-              </w:rPr>
-              <w:t>T8</w:t>
-            </w:r>
-          </w:p>
-        </w:tc>
-        <w:tc>
-          <w:tcPr>
-            <w:tcW w:type="dxa" w:w="1377"/>
-          </w:tcPr>
-          <w:p>
-            <w:pPr>
-              <w:jc w:val="center"/>
-            </w:pPr>
-            <w:r>
-              <w:rPr>
-                <w:sz w:val="16"/>
-              </w:rPr>
-              <w:t>15637–15977 m</w:t>
-            </w:r>
-          </w:p>
-        </w:tc>
-        <w:tc>
-          <w:tcPr>
-            <w:tcW w:type="dxa" w:w="1377"/>
-          </w:tcPr>
-          <w:p>
-            <w:pPr>
-              <w:jc w:val="center"/>
-            </w:pPr>
-            <w:r>
-              <w:rPr>
-                <w:sz w:val="16"/>
-              </w:rPr>
-              <w:t>0.34 km</w:t>
-            </w:r>
-          </w:p>
-        </w:tc>
-        <w:tc>
-          <w:tcPr>
-            <w:tcW w:type="dxa" w:w="1377"/>
-          </w:tcPr>
-          <w:p>
-            <w:pPr>
-              <w:jc w:val="center"/>
-            </w:pPr>
-            <w:r>
-              <w:rPr>
-                <w:sz w:val="16"/>
-              </w:rPr>
-              <w:t>94</w:t>
-            </w:r>
-          </w:p>
-        </w:tc>
-        <w:tc>
-          <w:tcPr>
-            <w:tcW w:type="dxa" w:w="1377"/>
-          </w:tcPr>
-          <w:p>
-            <w:pPr>
-              <w:jc w:val="center"/>
-            </w:pPr>
-            <w:r>
-              <w:rPr>
-                <w:sz w:val="16"/>
-              </w:rPr>
-              <w:t>85</w:t>
-            </w:r>
-          </w:p>
-        </w:tc>
-        <w:tc>
-          <w:tcPr>
-            <w:tcW w:type="dxa" w:w="1377"/>
-          </w:tcPr>
-          <w:p>
-            <w:pPr>
-              <w:jc w:val="center"/>
-            </w:pPr>
-            <w:r>
-              <w:rPr>
-                <w:sz w:val="16"/>
-              </w:rPr>
-              <w:t>102</w:t>
-            </w:r>
-          </w:p>
-        </w:tc>
-        <w:tc>
-          <w:tcPr>
-            <w:tcW w:type="dxa" w:w="1377"/>
-          </w:tcPr>
-          <w:p>
-            <w:pPr>
-              <w:jc w:val="center"/>
-            </w:pPr>
-            <w:r>
-              <w:rPr>
-                <w:sz w:val="16"/>
-              </w:rPr>
-              <w:t>6.7%</w:t>
-            </w:r>
-          </w:p>
-        </w:tc>
-      </w:tr>
-      <w:tr>
-        <w:tc>
-          <w:tcPr>
-            <w:tcW w:type="dxa" w:w="1377"/>
-          </w:tcPr>
-          <w:p>
-            <w:pPr>
-              <w:jc w:val="center"/>
-            </w:pPr>
-            <w:r>
-              <w:rPr>
-                <w:sz w:val="16"/>
-              </w:rPr>
-              <w:t>T9</w:t>
-            </w:r>
-          </w:p>
-        </w:tc>
-        <w:tc>
-          <w:tcPr>
-            <w:tcW w:type="dxa" w:w="1377"/>
-          </w:tcPr>
-          <w:p>
-            <w:pPr>
-              <w:jc w:val="center"/>
-            </w:pPr>
-            <w:r>
-              <w:rPr>
-                <w:sz w:val="16"/>
-              </w:rPr>
-              <w:t>15977–16182 m</w:t>
-            </w:r>
-          </w:p>
-        </w:tc>
-        <w:tc>
-          <w:tcPr>
-            <w:tcW w:type="dxa" w:w="1377"/>
-          </w:tcPr>
-          <w:p>
-            <w:pPr>
-              <w:jc w:val="center"/>
-            </w:pPr>
-            <w:r>
-              <w:rPr>
-                <w:sz w:val="16"/>
-              </w:rPr>
-              <w:t>0.20 km</w:t>
-            </w:r>
-          </w:p>
-        </w:tc>
-        <w:tc>
-          <w:tcPr>
-            <w:tcW w:type="dxa" w:w="1377"/>
-          </w:tcPr>
-          <w:p>
-            <w:pPr>
-              <w:jc w:val="center"/>
-            </w:pPr>
-            <w:r>
-              <w:rPr>
-                <w:sz w:val="16"/>
-              </w:rPr>
-              <w:t>75</w:t>
-            </w:r>
-          </w:p>
-        </w:tc>
-        <w:tc>
-          <w:tcPr>
-            <w:tcW w:type="dxa" w:w="1377"/>
-          </w:tcPr>
-          <w:p>
-            <w:pPr>
-              <w:jc w:val="center"/>
-            </w:pPr>
-            <w:r>
-              <w:rPr>
-                <w:sz w:val="16"/>
-              </w:rPr>
-              <w:t>73</w:t>
-            </w:r>
-          </w:p>
-        </w:tc>
-        <w:tc>
-          <w:tcPr>
-            <w:tcW w:type="dxa" w:w="1377"/>
-          </w:tcPr>
-          <w:p>
-            <w:pPr>
-              <w:jc w:val="center"/>
-            </w:pPr>
-            <w:r>
-              <w:rPr>
-                <w:sz w:val="16"/>
-              </w:rPr>
-              <w:t>82</w:t>
-            </w:r>
-          </w:p>
-        </w:tc>
-        <w:tc>
-          <w:tcPr>
-            <w:tcW w:type="dxa" w:w="1377"/>
-          </w:tcPr>
-          <w:p>
-            <w:pPr>
-              <w:jc w:val="center"/>
-            </w:pPr>
-            <w:r>
-              <w:rPr>
-                <w:sz w:val="16"/>
-              </w:rPr>
-              <w:t>4.3%</w:t>
+              <w:t>2.6%</w:t>
             </w:r>
           </w:p>
         </w:tc>
@@ -8357,7 +7673,7 @@
     </w:tbl>
     <w:p>
       <w:r>
-        <w:t>5 segmenti di intersezione esclusi dal calcolo.</w:t>
+        <w:t>11 segmenti di intersezione esclusi dal calcolo.</w:t>
       </w:r>
     </w:p>
     <w:sectPr>

</xml_diff>

<commit_message>
Raise intersection threshold to 85% and add mean-based tratte segmentation
- Change intersection detection threshold from 80% to 85% of corridor
  median V85, capturing more intersection segments (Ostia: 16, Centro: 24)
- Add compute_tratte_no_intersections_mean() using univariate 24h V85 mean
  instead of the full 24-hour profile for binary segmentation
- Print side-by-side comparison of both methods in main() output
- Results: methods agree for Dir. Ostia; Dir. Centro shows meaningful
  differences in the central corridor where segments have similar means
  but different temporal profiles

https://claude.ai/code/session_01C9yS1ptJzWrM5YXS1NsW3z
</commit_message>
<xml_diff>
--- a/output_colombo/ridotto/report_ridotto_colombo.docx
+++ b/output_colombo/ridotto/report_ridotto_colombo.docx
@@ -6294,7 +6294,7 @@
               <w:rPr>
                 <w:sz w:val="16"/>
               </w:rPr>
-              <w:t>366–5433 m</w:t>
+              <w:t>366–949 m</w:t>
             </w:r>
           </w:p>
         </w:tc>
@@ -6310,7 +6310,7 @@
               <w:rPr>
                 <w:sz w:val="16"/>
               </w:rPr>
-              <w:t>5.07 km</w:t>
+              <w:t>0.58 km</w:t>
             </w:r>
           </w:p>
         </w:tc>
@@ -6326,7 +6326,7 @@
               <w:rPr>
                 <w:sz w:val="16"/>
               </w:rPr>
-              <w:t>102</w:t>
+              <w:t>93</w:t>
             </w:r>
           </w:p>
         </w:tc>
@@ -6358,7 +6358,7 @@
               <w:rPr>
                 <w:sz w:val="16"/>
               </w:rPr>
-              <w:t>109</w:t>
+              <w:t>98</w:t>
             </w:r>
           </w:p>
         </w:tc>
@@ -6374,7 +6374,7 @@
               <w:rPr>
                 <w:sz w:val="16"/>
               </w:rPr>
-              <w:t>5.0%</w:t>
+              <w:t>4.8%</w:t>
             </w:r>
           </w:p>
         </w:tc>
@@ -6408,7 +6408,7 @@
               <w:rPr>
                 <w:sz w:val="16"/>
               </w:rPr>
-              <w:t>5433–6905 m</w:t>
+              <w:t>949–5433 m</w:t>
             </w:r>
           </w:p>
         </w:tc>
@@ -6424,7 +6424,7 @@
               <w:rPr>
                 <w:sz w:val="16"/>
               </w:rPr>
-              <w:t>1.47 km</w:t>
+              <w:t>4.48 km</w:t>
             </w:r>
           </w:p>
         </w:tc>
@@ -6440,7 +6440,7 @@
               <w:rPr>
                 <w:sz w:val="16"/>
               </w:rPr>
-              <w:t>90</w:t>
+              <w:t>103</w:t>
             </w:r>
           </w:p>
         </w:tc>
@@ -6456,7 +6456,7 @@
               <w:rPr>
                 <w:sz w:val="16"/>
               </w:rPr>
-              <w:t>82</w:t>
+              <w:t>97</w:t>
             </w:r>
           </w:p>
         </w:tc>
@@ -6472,7 +6472,7 @@
               <w:rPr>
                 <w:sz w:val="16"/>
               </w:rPr>
-              <w:t>100</w:t>
+              <w:t>109</w:t>
             </w:r>
           </w:p>
         </w:tc>
@@ -6488,7 +6488,7 @@
               <w:rPr>
                 <w:sz w:val="16"/>
               </w:rPr>
-              <w:t>7.1%</w:t>
+              <w:t>3.8%</w:t>
             </w:r>
           </w:p>
         </w:tc>
@@ -6522,7 +6522,7 @@
               <w:rPr>
                 <w:sz w:val="16"/>
               </w:rPr>
-              <w:t>6905–8815 m</w:t>
+              <w:t>5433–6905 m</w:t>
             </w:r>
           </w:p>
         </w:tc>
@@ -6538,7 +6538,7 @@
               <w:rPr>
                 <w:sz w:val="16"/>
               </w:rPr>
-              <w:t>1.91 km</w:t>
+              <w:t>1.47 km</w:t>
             </w:r>
           </w:p>
         </w:tc>
@@ -6554,6 +6554,22 @@
               <w:rPr>
                 <w:sz w:val="16"/>
               </w:rPr>
+              <w:t>90</w:t>
+            </w:r>
+          </w:p>
+        </w:tc>
+        <w:tc>
+          <w:tcPr>
+            <w:tcW w:type="dxa" w:w="1377"/>
+          </w:tcPr>
+          <w:p>
+            <w:pPr>
+              <w:jc w:val="center"/>
+            </w:pPr>
+            <w:r>
+              <w:rPr>
+                <w:sz w:val="16"/>
+              </w:rPr>
               <w:t>82</w:t>
             </w:r>
           </w:p>
@@ -6570,7 +6586,7 @@
               <w:rPr>
                 <w:sz w:val="16"/>
               </w:rPr>
-              <w:t>70</w:t>
+              <w:t>100</w:t>
             </w:r>
           </w:p>
         </w:tc>
@@ -6586,23 +6602,7 @@
               <w:rPr>
                 <w:sz w:val="16"/>
               </w:rPr>
-              <w:t>84</w:t>
-            </w:r>
-          </w:p>
-        </w:tc>
-        <w:tc>
-          <w:tcPr>
-            <w:tcW w:type="dxa" w:w="1377"/>
-          </w:tcPr>
-          <w:p>
-            <w:pPr>
-              <w:jc w:val="center"/>
-            </w:pPr>
-            <w:r>
-              <w:rPr>
-                <w:sz w:val="16"/>
-              </w:rPr>
-              <w:t>4.4%</w:t>
+              <w:t>7.1%</w:t>
             </w:r>
           </w:p>
         </w:tc>
@@ -6636,7 +6636,7 @@
               <w:rPr>
                 <w:sz w:val="16"/>
               </w:rPr>
-              <w:t>8703–10554 m</w:t>
+              <w:t>6905–10554 m</w:t>
             </w:r>
           </w:p>
         </w:tc>
@@ -6652,7 +6652,7 @@
               <w:rPr>
                 <w:sz w:val="16"/>
               </w:rPr>
-              <w:t>1.85 km</w:t>
+              <w:t>3.65 km</w:t>
             </w:r>
           </w:p>
         </w:tc>
@@ -6668,7 +6668,7 @@
               <w:rPr>
                 <w:sz w:val="16"/>
               </w:rPr>
-              <w:t>96</w:t>
+              <w:t>78</w:t>
             </w:r>
           </w:p>
         </w:tc>
@@ -6684,7 +6684,7 @@
               <w:rPr>
                 <w:sz w:val="16"/>
               </w:rPr>
-              <w:t>79</w:t>
+              <w:t>76</w:t>
             </w:r>
           </w:p>
         </w:tc>
@@ -6700,7 +6700,7 @@
               <w:rPr>
                 <w:sz w:val="16"/>
               </w:rPr>
-              <w:t>102</w:t>
+              <w:t>84</w:t>
             </w:r>
           </w:p>
         </w:tc>
@@ -6716,7 +6716,7 @@
               <w:rPr>
                 <w:sz w:val="16"/>
               </w:rPr>
-              <w:t>9.2%</w:t>
+              <w:t>2.8%</w:t>
             </w:r>
           </w:p>
         </w:tc>
@@ -6750,7 +6750,7 @@
               <w:rPr>
                 <w:sz w:val="16"/>
               </w:rPr>
-              <w:t>10554–16568 m</w:t>
+              <w:t>7335–16568 m</w:t>
             </w:r>
           </w:p>
         </w:tc>
@@ -6766,7 +6766,7 @@
               <w:rPr>
                 <w:sz w:val="16"/>
               </w:rPr>
-              <w:t>6.01 km</w:t>
+              <w:t>9.23 km</w:t>
             </w:r>
           </w:p>
         </w:tc>
@@ -6782,7 +6782,7 @@
               <w:rPr>
                 <w:sz w:val="16"/>
               </w:rPr>
-              <w:t>88</w:t>
+              <w:t>90</w:t>
             </w:r>
           </w:p>
         </w:tc>
@@ -6798,7 +6798,7 @@
               <w:rPr>
                 <w:sz w:val="16"/>
               </w:rPr>
-              <w:t>71</w:t>
+              <w:t>74</w:t>
             </w:r>
           </w:p>
         </w:tc>
@@ -6814,7 +6814,7 @@
               <w:rPr>
                 <w:sz w:val="16"/>
               </w:rPr>
-              <w:t>97</w:t>
+              <w:t>102</w:t>
             </w:r>
           </w:p>
         </w:tc>
@@ -6830,7 +6830,7 @@
               <w:rPr>
                 <w:sz w:val="16"/>
               </w:rPr>
-              <w:t>8.4%</w:t>
+              <w:t>7.4%</w:t>
             </w:r>
           </w:p>
         </w:tc>
@@ -6838,7 +6838,7 @@
     </w:tbl>
     <w:p>
       <w:r>
-        <w:t>9 segmenti di intersezione esclusi dal calcolo.</w:t>
+        <w:t>16 segmenti di intersezione esclusi dal calcolo.</w:t>
       </w:r>
     </w:p>
     <w:p>
@@ -7047,7 +7047,7 @@
               <w:rPr>
                 <w:sz w:val="16"/>
               </w:rPr>
-              <w:t>84</w:t>
+              <w:t>87</w:t>
             </w:r>
           </w:p>
         </w:tc>
@@ -7063,7 +7063,7 @@
               <w:rPr>
                 <w:sz w:val="16"/>
               </w:rPr>
-              <w:t>72</w:t>
+              <w:t>76</w:t>
             </w:r>
           </w:p>
         </w:tc>
@@ -7095,7 +7095,7 @@
               <w:rPr>
                 <w:sz w:val="16"/>
               </w:rPr>
-              <w:t>8.8%</w:t>
+              <w:t>5.7%</w:t>
             </w:r>
           </w:p>
         </w:tc>
@@ -7129,7 +7129,7 @@
               <w:rPr>
                 <w:sz w:val="16"/>
               </w:rPr>
-              <w:t>4742–7996 m</w:t>
+              <w:t>4942–9401 m</w:t>
             </w:r>
           </w:p>
         </w:tc>
@@ -7145,7 +7145,7 @@
               <w:rPr>
                 <w:sz w:val="16"/>
               </w:rPr>
-              <w:t>3.25 km</w:t>
+              <w:t>4.46 km</w:t>
             </w:r>
           </w:p>
         </w:tc>
@@ -7161,7 +7161,7 @@
               <w:rPr>
                 <w:sz w:val="16"/>
               </w:rPr>
-              <w:t>86</w:t>
+              <w:t>88</w:t>
             </w:r>
           </w:p>
         </w:tc>
@@ -7177,7 +7177,7 @@
               <w:rPr>
                 <w:sz w:val="16"/>
               </w:rPr>
-              <w:t>73</w:t>
+              <w:t>77</w:t>
             </w:r>
           </w:p>
         </w:tc>
@@ -7193,7 +7193,7 @@
               <w:rPr>
                 <w:sz w:val="16"/>
               </w:rPr>
-              <w:t>88</w:t>
+              <w:t>91</w:t>
             </w:r>
           </w:p>
         </w:tc>
@@ -7209,7 +7209,7 @@
               <w:rPr>
                 <w:sz w:val="16"/>
               </w:rPr>
-              <w:t>5.0%</w:t>
+              <w:t>3.5%</w:t>
             </w:r>
           </w:p>
         </w:tc>
@@ -7243,7 +7243,7 @@
               <w:rPr>
                 <w:sz w:val="16"/>
               </w:rPr>
-              <w:t>7996–9763 m</w:t>
+              <w:t>9401–13506 m</w:t>
             </w:r>
           </w:p>
         </w:tc>
@@ -7259,7 +7259,7 @@
               <w:rPr>
                 <w:sz w:val="16"/>
               </w:rPr>
-              <w:t>1.77 km</w:t>
+              <w:t>4.11 km</w:t>
             </w:r>
           </w:p>
         </w:tc>
@@ -7275,7 +7275,7 @@
               <w:rPr>
                 <w:sz w:val="16"/>
               </w:rPr>
-              <w:t>89</w:t>
+              <w:t>100</w:t>
             </w:r>
           </w:p>
         </w:tc>
@@ -7307,7 +7307,7 @@
               <w:rPr>
                 <w:sz w:val="16"/>
               </w:rPr>
-              <w:t>91</w:t>
+              <w:t>110</w:t>
             </w:r>
           </w:p>
         </w:tc>
@@ -7323,7 +7323,7 @@
               <w:rPr>
                 <w:sz w:val="16"/>
               </w:rPr>
-              <w:t>1.7%</w:t>
+              <w:t>5.2%</w:t>
             </w:r>
           </w:p>
         </w:tc>
@@ -7357,7 +7357,7 @@
               <w:rPr>
                 <w:sz w:val="16"/>
               </w:rPr>
-              <w:t>9763–15680 m</w:t>
+              <w:t>13506–15599 m</w:t>
             </w:r>
           </w:p>
         </w:tc>
@@ -7373,7 +7373,7 @@
               <w:rPr>
                 <w:sz w:val="16"/>
               </w:rPr>
-              <w:t>5.92 km</w:t>
+              <w:t>2.09 km</w:t>
             </w:r>
           </w:p>
         </w:tc>
@@ -7389,6 +7389,22 @@
               <w:rPr>
                 <w:sz w:val="16"/>
               </w:rPr>
+              <w:t>107</w:t>
+            </w:r>
+          </w:p>
+        </w:tc>
+        <w:tc>
+          <w:tcPr>
+            <w:tcW w:type="dxa" w:w="1377"/>
+          </w:tcPr>
+          <w:p>
+            <w:pPr>
+              <w:jc w:val="center"/>
+            </w:pPr>
+            <w:r>
+              <w:rPr>
+                <w:sz w:val="16"/>
+              </w:rPr>
               <w:t>103</w:t>
             </w:r>
           </w:p>
@@ -7405,7 +7421,7 @@
               <w:rPr>
                 <w:sz w:val="16"/>
               </w:rPr>
-              <w:t>96</w:t>
+              <w:t>110</w:t>
             </w:r>
           </w:p>
         </w:tc>
@@ -7421,23 +7437,7 @@
               <w:rPr>
                 <w:sz w:val="16"/>
               </w:rPr>
-              <w:t>110</w:t>
-            </w:r>
-          </w:p>
-        </w:tc>
-        <w:tc>
-          <w:tcPr>
-            <w:tcW w:type="dxa" w:w="1377"/>
-          </w:tcPr>
-          <w:p>
-            <w:pPr>
-              <w:jc w:val="center"/>
-            </w:pPr>
-            <w:r>
-              <w:rPr>
-                <w:sz w:val="16"/>
-              </w:rPr>
-              <w:t>4.1%</w:t>
+              <w:t>2.1%</w:t>
             </w:r>
           </w:p>
         </w:tc>
@@ -7471,7 +7471,7 @@
               <w:rPr>
                 <w:sz w:val="16"/>
               </w:rPr>
-              <w:t>15680–16003 m</w:t>
+              <w:t>15599–15820 m</w:t>
             </w:r>
           </w:p>
         </w:tc>
@@ -7487,7 +7487,7 @@
               <w:rPr>
                 <w:sz w:val="16"/>
               </w:rPr>
-              <w:t>0.32 km</w:t>
+              <w:t>0.22 km</w:t>
             </w:r>
           </w:p>
         </w:tc>
@@ -7503,7 +7503,7 @@
               <w:rPr>
                 <w:sz w:val="16"/>
               </w:rPr>
-              <w:t>92</w:t>
+              <w:t>100</w:t>
             </w:r>
           </w:p>
         </w:tc>
@@ -7519,7 +7519,7 @@
               <w:rPr>
                 <w:sz w:val="16"/>
               </w:rPr>
-              <w:t>82</w:t>
+              <w:t>97</w:t>
             </w:r>
           </w:p>
         </w:tc>
@@ -7535,7 +7535,7 @@
               <w:rPr>
                 <w:sz w:val="16"/>
               </w:rPr>
-              <w:t>100</w:t>
+              <w:t>103</w:t>
             </w:r>
           </w:p>
         </w:tc>
@@ -7551,7 +7551,7 @@
               <w:rPr>
                 <w:sz w:val="16"/>
               </w:rPr>
-              <w:t>7.0%</w:t>
+              <w:t>2.3%</w:t>
             </w:r>
           </w:p>
         </w:tc>
@@ -7585,7 +7585,7 @@
               <w:rPr>
                 <w:sz w:val="16"/>
               </w:rPr>
-              <w:t>16003–16182 m</w:t>
+              <w:t>15820–16182 m</w:t>
             </w:r>
           </w:p>
         </w:tc>
@@ -7601,7 +7601,7 @@
               <w:rPr>
                 <w:sz w:val="16"/>
               </w:rPr>
-              <w:t>0.18 km</w:t>
+              <w:t>0.36 km</w:t>
             </w:r>
           </w:p>
         </w:tc>
@@ -7617,7 +7617,7 @@
               <w:rPr>
                 <w:sz w:val="16"/>
               </w:rPr>
-              <w:t>74</w:t>
+              <w:t>86</w:t>
             </w:r>
           </w:p>
         </w:tc>
@@ -7633,7 +7633,7 @@
               <w:rPr>
                 <w:sz w:val="16"/>
               </w:rPr>
-              <w:t>73</w:t>
+              <w:t>75</w:t>
             </w:r>
           </w:p>
         </w:tc>
@@ -7649,7 +7649,7 @@
               <w:rPr>
                 <w:sz w:val="16"/>
               </w:rPr>
-              <w:t>80</w:t>
+              <w:t>92</w:t>
             </w:r>
           </w:p>
         </w:tc>
@@ -7665,7 +7665,7 @@
               <w:rPr>
                 <w:sz w:val="16"/>
               </w:rPr>
-              <w:t>2.6%</w:t>
+              <w:t>5.6%</w:t>
             </w:r>
           </w:p>
         </w:tc>
@@ -7673,7 +7673,7 @@
     </w:tbl>
     <w:p>
       <w:r>
-        <w:t>11 segmenti di intersezione esclusi dal calcolo.</w:t>
+        <w:t>24 segmenti di intersezione esclusi dal calcolo.</w:t>
       </w:r>
     </w:p>
     <w:sectPr>

</xml_diff>

<commit_message>
Reduce tratte by lowering breakpoints to 4 and adding post-merge (5 km/h)
- n_bkps reduced from 5 to 4 in both segmentation functions
- After binary segmentation, adjacent tratte with V85 difference < 5 km/h
  are merged iteratively (minimum 2 tratte preserved)
- Results: Ostia 6→5 (24h) / 6→4 (mean); Centro 6→4 (24h) / 6→5 (mean)

https://claude.ai/code/session_01C9yS1ptJzWrM5YXS1NsW3z
</commit_message>
<xml_diff>
--- a/output_colombo/ridotto/report_ridotto_colombo.docx
+++ b/output_colombo/ridotto/report_ridotto_colombo.docx
@@ -6294,7 +6294,7 @@
               <w:rPr>
                 <w:sz w:val="16"/>
               </w:rPr>
-              <w:t>366–949 m</w:t>
+              <w:t>366–5433 m</w:t>
             </w:r>
           </w:p>
         </w:tc>
@@ -6310,7 +6310,7 @@
               <w:rPr>
                 <w:sz w:val="16"/>
               </w:rPr>
-              <w:t>0.58 km</w:t>
+              <w:t>5.07 km</w:t>
             </w:r>
           </w:p>
         </w:tc>
@@ -6326,7 +6326,7 @@
               <w:rPr>
                 <w:sz w:val="16"/>
               </w:rPr>
-              <w:t>93</w:t>
+              <w:t>102</w:t>
             </w:r>
           </w:p>
         </w:tc>
@@ -6358,7 +6358,7 @@
               <w:rPr>
                 <w:sz w:val="16"/>
               </w:rPr>
-              <w:t>98</w:t>
+              <w:t>109</w:t>
             </w:r>
           </w:p>
         </w:tc>
@@ -6374,7 +6374,7 @@
               <w:rPr>
                 <w:sz w:val="16"/>
               </w:rPr>
-              <w:t>4.8%</w:t>
+              <w:t>5.0%</w:t>
             </w:r>
           </w:p>
         </w:tc>
@@ -6393,120 +6393,6 @@
                 <w:sz w:val="16"/>
               </w:rPr>
               <w:t>T3</w:t>
-            </w:r>
-          </w:p>
-        </w:tc>
-        <w:tc>
-          <w:tcPr>
-            <w:tcW w:type="dxa" w:w="1377"/>
-          </w:tcPr>
-          <w:p>
-            <w:pPr>
-              <w:jc w:val="center"/>
-            </w:pPr>
-            <w:r>
-              <w:rPr>
-                <w:sz w:val="16"/>
-              </w:rPr>
-              <w:t>949–5433 m</w:t>
-            </w:r>
-          </w:p>
-        </w:tc>
-        <w:tc>
-          <w:tcPr>
-            <w:tcW w:type="dxa" w:w="1377"/>
-          </w:tcPr>
-          <w:p>
-            <w:pPr>
-              <w:jc w:val="center"/>
-            </w:pPr>
-            <w:r>
-              <w:rPr>
-                <w:sz w:val="16"/>
-              </w:rPr>
-              <w:t>4.48 km</w:t>
-            </w:r>
-          </w:p>
-        </w:tc>
-        <w:tc>
-          <w:tcPr>
-            <w:tcW w:type="dxa" w:w="1377"/>
-          </w:tcPr>
-          <w:p>
-            <w:pPr>
-              <w:jc w:val="center"/>
-            </w:pPr>
-            <w:r>
-              <w:rPr>
-                <w:sz w:val="16"/>
-              </w:rPr>
-              <w:t>103</w:t>
-            </w:r>
-          </w:p>
-        </w:tc>
-        <w:tc>
-          <w:tcPr>
-            <w:tcW w:type="dxa" w:w="1377"/>
-          </w:tcPr>
-          <w:p>
-            <w:pPr>
-              <w:jc w:val="center"/>
-            </w:pPr>
-            <w:r>
-              <w:rPr>
-                <w:sz w:val="16"/>
-              </w:rPr>
-              <w:t>97</w:t>
-            </w:r>
-          </w:p>
-        </w:tc>
-        <w:tc>
-          <w:tcPr>
-            <w:tcW w:type="dxa" w:w="1377"/>
-          </w:tcPr>
-          <w:p>
-            <w:pPr>
-              <w:jc w:val="center"/>
-            </w:pPr>
-            <w:r>
-              <w:rPr>
-                <w:sz w:val="16"/>
-              </w:rPr>
-              <w:t>109</w:t>
-            </w:r>
-          </w:p>
-        </w:tc>
-        <w:tc>
-          <w:tcPr>
-            <w:tcW w:type="dxa" w:w="1377"/>
-          </w:tcPr>
-          <w:p>
-            <w:pPr>
-              <w:jc w:val="center"/>
-            </w:pPr>
-            <w:r>
-              <w:rPr>
-                <w:sz w:val="16"/>
-              </w:rPr>
-              <w:t>3.8%</w:t>
-            </w:r>
-          </w:p>
-        </w:tc>
-      </w:tr>
-      <w:tr>
-        <w:tc>
-          <w:tcPr>
-            <w:tcW w:type="dxa" w:w="1377"/>
-          </w:tcPr>
-          <w:p>
-            <w:pPr>
-              <w:jc w:val="center"/>
-            </w:pPr>
-            <w:r>
-              <w:rPr>
-                <w:sz w:val="16"/>
-              </w:rPr>
-              <w:t>T4</w:t>
             </w:r>
           </w:p>
         </w:tc>
@@ -6620,7 +6506,7 @@
               <w:rPr>
                 <w:sz w:val="16"/>
               </w:rPr>
-              <w:t>T5</w:t>
+              <w:t>T4</w:t>
             </w:r>
           </w:p>
         </w:tc>
@@ -6734,7 +6620,7 @@
               <w:rPr>
                 <w:sz w:val="16"/>
               </w:rPr>
-              <w:t>T6</w:t>
+              <w:t>T5</w:t>
             </w:r>
           </w:p>
         </w:tc>
@@ -7015,7 +6901,7 @@
               <w:rPr>
                 <w:sz w:val="16"/>
               </w:rPr>
-              <w:t>0–4942 m</w:t>
+              <w:t>0–9401 m</w:t>
             </w:r>
           </w:p>
         </w:tc>
@@ -7031,7 +6917,7 @@
               <w:rPr>
                 <w:sz w:val="16"/>
               </w:rPr>
-              <w:t>4.94 km</w:t>
+              <w:t>9.40 km</w:t>
             </w:r>
           </w:p>
         </w:tc>
@@ -7095,7 +6981,7 @@
               <w:rPr>
                 <w:sz w:val="16"/>
               </w:rPr>
-              <w:t>5.7%</w:t>
+              <w:t>4.7%</w:t>
             </w:r>
           </w:p>
         </w:tc>
@@ -7114,120 +7000,6 @@
                 <w:sz w:val="16"/>
               </w:rPr>
               <w:t>T2</w:t>
-            </w:r>
-          </w:p>
-        </w:tc>
-        <w:tc>
-          <w:tcPr>
-            <w:tcW w:type="dxa" w:w="1377"/>
-          </w:tcPr>
-          <w:p>
-            <w:pPr>
-              <w:jc w:val="center"/>
-            </w:pPr>
-            <w:r>
-              <w:rPr>
-                <w:sz w:val="16"/>
-              </w:rPr>
-              <w:t>4942–9401 m</w:t>
-            </w:r>
-          </w:p>
-        </w:tc>
-        <w:tc>
-          <w:tcPr>
-            <w:tcW w:type="dxa" w:w="1377"/>
-          </w:tcPr>
-          <w:p>
-            <w:pPr>
-              <w:jc w:val="center"/>
-            </w:pPr>
-            <w:r>
-              <w:rPr>
-                <w:sz w:val="16"/>
-              </w:rPr>
-              <w:t>4.46 km</w:t>
-            </w:r>
-          </w:p>
-        </w:tc>
-        <w:tc>
-          <w:tcPr>
-            <w:tcW w:type="dxa" w:w="1377"/>
-          </w:tcPr>
-          <w:p>
-            <w:pPr>
-              <w:jc w:val="center"/>
-            </w:pPr>
-            <w:r>
-              <w:rPr>
-                <w:sz w:val="16"/>
-              </w:rPr>
-              <w:t>88</w:t>
-            </w:r>
-          </w:p>
-        </w:tc>
-        <w:tc>
-          <w:tcPr>
-            <w:tcW w:type="dxa" w:w="1377"/>
-          </w:tcPr>
-          <w:p>
-            <w:pPr>
-              <w:jc w:val="center"/>
-            </w:pPr>
-            <w:r>
-              <w:rPr>
-                <w:sz w:val="16"/>
-              </w:rPr>
-              <w:t>77</w:t>
-            </w:r>
-          </w:p>
-        </w:tc>
-        <w:tc>
-          <w:tcPr>
-            <w:tcW w:type="dxa" w:w="1377"/>
-          </w:tcPr>
-          <w:p>
-            <w:pPr>
-              <w:jc w:val="center"/>
-            </w:pPr>
-            <w:r>
-              <w:rPr>
-                <w:sz w:val="16"/>
-              </w:rPr>
-              <w:t>91</w:t>
-            </w:r>
-          </w:p>
-        </w:tc>
-        <w:tc>
-          <w:tcPr>
-            <w:tcW w:type="dxa" w:w="1377"/>
-          </w:tcPr>
-          <w:p>
-            <w:pPr>
-              <w:jc w:val="center"/>
-            </w:pPr>
-            <w:r>
-              <w:rPr>
-                <w:sz w:val="16"/>
-              </w:rPr>
-              <w:t>3.5%</w:t>
-            </w:r>
-          </w:p>
-        </w:tc>
-      </w:tr>
-      <w:tr>
-        <w:tc>
-          <w:tcPr>
-            <w:tcW w:type="dxa" w:w="1377"/>
-          </w:tcPr>
-          <w:p>
-            <w:pPr>
-              <w:jc w:val="center"/>
-            </w:pPr>
-            <w:r>
-              <w:rPr>
-                <w:sz w:val="16"/>
-              </w:rPr>
-              <w:t>T3</w:t>
             </w:r>
           </w:p>
         </w:tc>
@@ -7341,7 +7113,7 @@
               <w:rPr>
                 <w:sz w:val="16"/>
               </w:rPr>
-              <w:t>T4</w:t>
+              <w:t>T3</w:t>
             </w:r>
           </w:p>
         </w:tc>
@@ -7357,7 +7129,7 @@
               <w:rPr>
                 <w:sz w:val="16"/>
               </w:rPr>
-              <w:t>13506–15599 m</w:t>
+              <w:t>13506–15820 m</w:t>
             </w:r>
           </w:p>
         </w:tc>
@@ -7373,7 +7145,7 @@
               <w:rPr>
                 <w:sz w:val="16"/>
               </w:rPr>
-              <w:t>2.09 km</w:t>
+              <w:t>2.31 km</w:t>
             </w:r>
           </w:p>
         </w:tc>
@@ -7389,7 +7161,7 @@
               <w:rPr>
                 <w:sz w:val="16"/>
               </w:rPr>
-              <w:t>107</w:t>
+              <w:t>106</w:t>
             </w:r>
           </w:p>
         </w:tc>
@@ -7405,7 +7177,7 @@
               <w:rPr>
                 <w:sz w:val="16"/>
               </w:rPr>
-              <w:t>103</w:t>
+              <w:t>97</w:t>
             </w:r>
           </w:p>
         </w:tc>
@@ -7437,7 +7209,7 @@
               <w:rPr>
                 <w:sz w:val="16"/>
               </w:rPr>
-              <w:t>2.1%</w:t>
+              <w:t>2.8%</w:t>
             </w:r>
           </w:p>
         </w:tc>
@@ -7455,121 +7227,7 @@
               <w:rPr>
                 <w:sz w:val="16"/>
               </w:rPr>
-              <w:t>T5</w:t>
-            </w:r>
-          </w:p>
-        </w:tc>
-        <w:tc>
-          <w:tcPr>
-            <w:tcW w:type="dxa" w:w="1377"/>
-          </w:tcPr>
-          <w:p>
-            <w:pPr>
-              <w:jc w:val="center"/>
-            </w:pPr>
-            <w:r>
-              <w:rPr>
-                <w:sz w:val="16"/>
-              </w:rPr>
-              <w:t>15599–15820 m</w:t>
-            </w:r>
-          </w:p>
-        </w:tc>
-        <w:tc>
-          <w:tcPr>
-            <w:tcW w:type="dxa" w:w="1377"/>
-          </w:tcPr>
-          <w:p>
-            <w:pPr>
-              <w:jc w:val="center"/>
-            </w:pPr>
-            <w:r>
-              <w:rPr>
-                <w:sz w:val="16"/>
-              </w:rPr>
-              <w:t>0.22 km</w:t>
-            </w:r>
-          </w:p>
-        </w:tc>
-        <w:tc>
-          <w:tcPr>
-            <w:tcW w:type="dxa" w:w="1377"/>
-          </w:tcPr>
-          <w:p>
-            <w:pPr>
-              <w:jc w:val="center"/>
-            </w:pPr>
-            <w:r>
-              <w:rPr>
-                <w:sz w:val="16"/>
-              </w:rPr>
-              <w:t>100</w:t>
-            </w:r>
-          </w:p>
-        </w:tc>
-        <w:tc>
-          <w:tcPr>
-            <w:tcW w:type="dxa" w:w="1377"/>
-          </w:tcPr>
-          <w:p>
-            <w:pPr>
-              <w:jc w:val="center"/>
-            </w:pPr>
-            <w:r>
-              <w:rPr>
-                <w:sz w:val="16"/>
-              </w:rPr>
-              <w:t>97</w:t>
-            </w:r>
-          </w:p>
-        </w:tc>
-        <w:tc>
-          <w:tcPr>
-            <w:tcW w:type="dxa" w:w="1377"/>
-          </w:tcPr>
-          <w:p>
-            <w:pPr>
-              <w:jc w:val="center"/>
-            </w:pPr>
-            <w:r>
-              <w:rPr>
-                <w:sz w:val="16"/>
-              </w:rPr>
-              <w:t>103</w:t>
-            </w:r>
-          </w:p>
-        </w:tc>
-        <w:tc>
-          <w:tcPr>
-            <w:tcW w:type="dxa" w:w="1377"/>
-          </w:tcPr>
-          <w:p>
-            <w:pPr>
-              <w:jc w:val="center"/>
-            </w:pPr>
-            <w:r>
-              <w:rPr>
-                <w:sz w:val="16"/>
-              </w:rPr>
-              <w:t>2.3%</w:t>
-            </w:r>
-          </w:p>
-        </w:tc>
-      </w:tr>
-      <w:tr>
-        <w:tc>
-          <w:tcPr>
-            <w:tcW w:type="dxa" w:w="1377"/>
-          </w:tcPr>
-          <w:p>
-            <w:pPr>
-              <w:jc w:val="center"/>
-            </w:pPr>
-            <w:r>
-              <w:rPr>
-                <w:sz w:val="16"/>
-              </w:rPr>
-              <w:t>T6</w:t>
+              <w:t>T4</w:t>
             </w:r>
           </w:p>
         </w:tc>

</xml_diff>